<commit_message>
Migrate from Next.js to Astro with React
Replace Next.js framework with Astro + @astrojs/react for static site
generation. Add language pages, text alternatives pages, Canvas/PDF/
PowerPoint content, audio demos, and supporting assets. Update .gitignore
for Astro build artifacts.

Co-authored-by: Cursor <cursoragent@cursor.com>
</commit_message>
<xml_diff>
--- a/Test files/images/Image-Word.docx
+++ b/Test files/images/Image-Word.docx
@@ -4,7 +4,7 @@
   <w:body>
     <w:p>
       <w:pPr>
-        <w:pStyle w:val="Heading2"/>
+        <w:pStyle w:val="Heading1"/>
       </w:pPr>
       <w:r>
         <w:t>Example error: Images in MS Word</w:t>
@@ -44,7 +44,7 @@
                     <pic:cNvPicPr/>
                   </pic:nvPicPr>
                   <pic:blipFill>
-                    <a:blip r:embed="rId4" cstate="print">
+                    <a:blip r:embed="rId5" cstate="print">
                       <a:extLst>
                         <a:ext uri="{28A0092B-C50C-407E-A947-70E740481C1C}">
                           <a14:useLocalDpi xmlns:a14="http://schemas.microsoft.com/office/drawing/2010/main" val="0"/>
@@ -191,7 +191,7 @@
           </w:tcPr>
           <w:p>
             <w:r>
-              <w:t>Yes</w:t>
+              <w:t>Detected</w:t>
             </w:r>
           </w:p>
         </w:tc>
@@ -201,7 +201,7 @@
           </w:tcPr>
           <w:p>
             <w:r>
-              <w:t>Yes</w:t>
+              <w:t>Detected</w:t>
             </w:r>
           </w:p>
         </w:tc>
@@ -226,7 +226,7 @@
           <w:noProof/>
         </w:rPr>
         <w:drawing>
-          <wp:inline distT="0" distB="0" distL="0" distR="0" wp14:anchorId="60EFA342" wp14:editId="1E34F17A">
+          <wp:inline distT="0" distB="0" distL="0" distR="0" wp14:anchorId="60EFA342" wp14:editId="5664C1D7">
             <wp:extent cx="2011680" cy="532149"/>
             <wp:effectExtent l="0" t="0" r="0" b="1270"/>
             <wp:docPr id="1810832810" name="Picture 2" descr="A black background with white text&#10;&#10;AI-generated content may be incorrect."/>
@@ -241,7 +241,7 @@
                     <pic:cNvPicPr/>
                   </pic:nvPicPr>
                   <pic:blipFill>
-                    <a:blip r:embed="rId5" cstate="print">
+                    <a:blip r:embed="rId6" cstate="print">
                       <a:extLst>
                         <a:ext uri="{28A0092B-C50C-407E-A947-70E740481C1C}">
                           <a14:useLocalDpi xmlns:a14="http://schemas.microsoft.com/office/drawing/2010/main" val="0"/>
@@ -388,7 +388,10 @@
           </w:tcPr>
           <w:p>
             <w:r>
-              <w:t>No</w:t>
+              <w:t xml:space="preserve">Not </w:t>
+            </w:r>
+            <w:r>
+              <w:t>Detected</w:t>
             </w:r>
           </w:p>
         </w:tc>
@@ -398,17 +401,12 @@
           </w:tcPr>
           <w:p>
             <w:r>
-              <w:t>Yes</w:t>
+              <w:t>Detected</w:t>
             </w:r>
           </w:p>
         </w:tc>
       </w:tr>
     </w:tbl>
-    <w:p>
-      <w:r>
-        <w:t xml:space="preserve">Manual check required. </w:t>
-      </w:r>
-    </w:p>
     <w:p>
       <w:pPr>
         <w:pStyle w:val="Heading2"/>
@@ -430,7 +428,7 @@
         <mc:AlternateContent>
           <mc:Choice Requires="wps">
             <w:drawing>
-              <wp:anchor distT="0" distB="0" distL="114300" distR="114300" simplePos="0" relativeHeight="251659264" behindDoc="0" locked="0" layoutInCell="1" allowOverlap="1" wp14:anchorId="4AD421DD" wp14:editId="1296A708">
+              <wp:anchor distT="0" distB="0" distL="114300" distR="114300" simplePos="0" relativeHeight="251659264" behindDoc="0" locked="0" layoutInCell="1" allowOverlap="1" wp14:anchorId="4AD421DD" wp14:editId="0EBFBFAD">
                 <wp:simplePos x="0" y="0"/>
                 <wp:positionH relativeFrom="column">
                   <wp:posOffset>0</wp:posOffset>
@@ -489,7 +487,7 @@
           </mc:Choice>
           <mc:Fallback>
             <w:pict>
-              <v:rect w14:anchorId="0A668C44" id="Rectangle 3" o:spid="_x0000_s1026" alt="Red separator bar. " style="position:absolute;margin-left:0;margin-top:0;width:499.4pt;height:4.05pt;z-index:251659264;visibility:visible;mso-wrap-style:square;mso-wrap-distance-left:9pt;mso-wrap-distance-top:0;mso-wrap-distance-right:9pt;mso-wrap-distance-bottom:0;mso-position-horizontal:absolute;mso-position-horizontal-relative:text;mso-position-vertical:absolute;mso-position-vertical-relative:text;v-text-anchor:middle" o:gfxdata="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" fillcolor="#c03" strokecolor="#030e13 [484]" strokeweight="1pt"/>
+              <v:rect w14:anchorId="65D1113E" id="Rectangle 3" o:spid="_x0000_s1026" alt="Red separator bar. " style="position:absolute;margin-left:0;margin-top:0;width:499.4pt;height:4.05pt;z-index:251659264;visibility:visible;mso-wrap-style:square;mso-wrap-distance-left:9pt;mso-wrap-distance-top:0;mso-wrap-distance-right:9pt;mso-wrap-distance-bottom:0;mso-position-horizontal:absolute;mso-position-horizontal-relative:text;mso-position-vertical:absolute;mso-position-vertical-relative:text;v-text-anchor:middle" o:gfxdata="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" fillcolor="#c03" strokecolor="#030e13 [484]" strokeweight="1pt"/>
             </w:pict>
           </mc:Fallback>
         </mc:AlternateContent>
@@ -615,7 +613,10 @@
           </w:tcPr>
           <w:p>
             <w:r>
-              <w:t>No</w:t>
+              <w:t xml:space="preserve">Not </w:t>
+            </w:r>
+            <w:r>
+              <w:t>Detected</w:t>
             </w:r>
           </w:p>
         </w:tc>
@@ -625,15 +626,31 @@
           </w:tcPr>
           <w:p>
             <w:r>
-              <w:t>No</w:t>
+              <w:t xml:space="preserve">Not </w:t>
+            </w:r>
+            <w:r>
+              <w:t>Detected</w:t>
             </w:r>
           </w:p>
         </w:tc>
       </w:tr>
     </w:tbl>
     <w:p>
-      <w:r>
-        <w:t xml:space="preserve">Manual check required. </w:t>
+      <w:pPr>
+        <w:pStyle w:val="Heading2"/>
+      </w:pPr>
+    </w:p>
+    <w:p>
+      <w:pPr>
+        <w:rPr>
+          <w:rFonts w:asciiTheme="majorHAnsi" w:eastAsiaTheme="majorEastAsia" w:hAnsiTheme="majorHAnsi" w:cstheme="majorBidi"/>
+          <w:color w:val="0F4761" w:themeColor="accent1" w:themeShade="BF"/>
+          <w:sz w:val="32"/>
+          <w:szCs w:val="32"/>
+        </w:rPr>
+      </w:pPr>
+      <w:r>
+        <w:br w:type="page"/>
       </w:r>
     </w:p>
     <w:p>
@@ -641,6 +658,7 @@
         <w:pStyle w:val="Heading2"/>
       </w:pPr>
       <w:r>
+        <w:lastRenderedPageBreak/>
         <w:t xml:space="preserve">Poorly constructed </w:t>
       </w:r>
       <w:r>
@@ -663,16 +681,15 @@
         <w:rPr>
           <w:noProof/>
         </w:rPr>
-        <w:lastRenderedPageBreak/>
         <w:drawing>
-          <wp:inline distT="0" distB="0" distL="0" distR="0" wp14:anchorId="60CCEDDD" wp14:editId="69C1291A">
-            <wp:extent cx="4175935" cy="2435962"/>
-            <wp:effectExtent l="0" t="0" r="15240" b="15240"/>
+          <wp:inline distT="0" distB="0" distL="0" distR="0" wp14:anchorId="60CCEDDD" wp14:editId="61F85A96">
+            <wp:extent cx="6297930" cy="3196641"/>
+            <wp:effectExtent l="0" t="0" r="13970" b="16510"/>
             <wp:docPr id="418544126" name="Chart 4" descr="Quiz averages. "/>
             <wp:cNvGraphicFramePr/>
             <a:graphic xmlns:a="http://schemas.openxmlformats.org/drawingml/2006/main">
               <a:graphicData uri="http://schemas.openxmlformats.org/drawingml/2006/chart">
-                <c:chart xmlns:c="http://schemas.openxmlformats.org/drawingml/2006/chart" xmlns:r="http://schemas.openxmlformats.org/officeDocument/2006/relationships" r:id="rId6"/>
+                <c:chart xmlns:c="http://schemas.openxmlformats.org/drawingml/2006/chart" xmlns:r="http://schemas.openxmlformats.org/officeDocument/2006/relationships" r:id="rId7"/>
               </a:graphicData>
             </a:graphic>
           </wp:inline>
@@ -799,7 +816,10 @@
           </w:tcPr>
           <w:p>
             <w:r>
-              <w:t>No</w:t>
+              <w:t xml:space="preserve">Not </w:t>
+            </w:r>
+            <w:r>
+              <w:t>Detected</w:t>
             </w:r>
           </w:p>
         </w:tc>
@@ -809,15 +829,31 @@
           </w:tcPr>
           <w:p>
             <w:r>
-              <w:t>No</w:t>
+              <w:t xml:space="preserve">Not </w:t>
+            </w:r>
+            <w:r>
+              <w:t>Detected</w:t>
             </w:r>
           </w:p>
         </w:tc>
       </w:tr>
     </w:tbl>
     <w:p>
-      <w:r>
-        <w:t xml:space="preserve">Manual check required. </w:t>
+      <w:pPr>
+        <w:pStyle w:val="Heading2"/>
+      </w:pPr>
+    </w:p>
+    <w:p>
+      <w:pPr>
+        <w:rPr>
+          <w:rFonts w:asciiTheme="majorHAnsi" w:eastAsiaTheme="majorEastAsia" w:hAnsiTheme="majorHAnsi" w:cstheme="majorBidi"/>
+          <w:color w:val="0F4761" w:themeColor="accent1" w:themeShade="BF"/>
+          <w:sz w:val="32"/>
+          <w:szCs w:val="32"/>
+        </w:rPr>
+      </w:pPr>
+      <w:r>
+        <w:br w:type="page"/>
       </w:r>
     </w:p>
     <w:p>
@@ -825,6 +861,284 @@
         <w:pStyle w:val="Heading2"/>
       </w:pPr>
       <w:r>
+        <w:lastRenderedPageBreak/>
+        <w:t>Dense</w:t>
+      </w:r>
+      <w:r>
+        <w:t xml:space="preserve"> al</w:t>
+      </w:r>
+      <w:r>
+        <w:t>t</w:t>
+      </w:r>
+      <w:r>
+        <w:t xml:space="preserve"> text</w:t>
+      </w:r>
+    </w:p>
+    <w:p>
+      <w:r>
+        <w:t>The text alternative here reads: “</w:t>
+      </w:r>
+      <w:r>
+        <w:t>G</w:t>
+      </w:r>
+      <w:r>
+        <w:t>rouped bar graph comparing Quiz 1 and Quiz 2 averages across three sections. Section 1: 85% and 82%. Section 2: 83% and 81%. Section 3: 85% and 82%.</w:t>
+      </w:r>
+      <w:r>
+        <w:t xml:space="preserve">” </w:t>
+      </w:r>
+      <w:r>
+        <w:t>This</w:t>
+      </w:r>
+      <w:r>
+        <w:t xml:space="preserve"> text alternative</w:t>
+      </w:r>
+      <w:r>
+        <w:t xml:space="preserve"> is </w:t>
+      </w:r>
+      <w:r>
+        <w:t>156</w:t>
+      </w:r>
+      <w:r>
+        <w:t xml:space="preserve"> characters</w:t>
+      </w:r>
+      <w:r>
+        <w:t>,</w:t>
+      </w:r>
+      <w:r>
+        <w:t xml:space="preserve"> which </w:t>
+      </w:r>
+      <w:r>
+        <w:t>Ally</w:t>
+      </w:r>
+      <w:r>
+        <w:t xml:space="preserve"> </w:t>
+      </w:r>
+      <w:r>
+        <w:t>incorrectly</w:t>
+      </w:r>
+      <w:r>
+        <w:t xml:space="preserve"> flag</w:t>
+      </w:r>
+      <w:r>
+        <w:t>s</w:t>
+      </w:r>
+      <w:r>
+        <w:t xml:space="preserve"> </w:t>
+      </w:r>
+      <w:r>
+        <w:t>when</w:t>
+      </w:r>
+      <w:r>
+        <w:t xml:space="preserve"> uploading an image in the Rich Content Editor, but not here in a Word doc</w:t>
+      </w:r>
+      <w:r>
+        <w:t xml:space="preserve">. </w:t>
+      </w:r>
+    </w:p>
+    <w:p>
+      <w:r>
+        <w:rPr>
+          <w:noProof/>
+        </w:rPr>
+        <w:drawing>
+          <wp:inline distT="0" distB="0" distL="0" distR="0" wp14:anchorId="3CC0B4D6" wp14:editId="781B0AF5">
+            <wp:extent cx="5943600" cy="3031474"/>
+            <wp:effectExtent l="0" t="0" r="0" b="4445"/>
+            <wp:docPr id="1889569795" name="Picture 2" descr="Grouped bar graph comparing Quiz 1 and Quiz 2 averages across three sections. Section 1: 85% and 82%. Section 2: 83% and 81%. Section 3: 85% and 82%."/>
+            <wp:cNvGraphicFramePr>
+              <a:graphicFrameLocks xmlns:a="http://schemas.openxmlformats.org/drawingml/2006/main" noChangeAspect="1"/>
+            </wp:cNvGraphicFramePr>
+            <a:graphic xmlns:a="http://schemas.openxmlformats.org/drawingml/2006/main">
+              <a:graphicData uri="http://schemas.openxmlformats.org/drawingml/2006/picture">
+                <pic:pic xmlns:pic="http://schemas.openxmlformats.org/drawingml/2006/picture">
+                  <pic:nvPicPr>
+                    <pic:cNvPr id="1889569795" name="Picture 2" descr="Grouped bar graph comparing Quiz 1 and Quiz 2 averages across three sections. Section 1: 85% and 82%. Section 2: 83% and 81%. Section 3: 85% and 82%."/>
+                    <pic:cNvPicPr/>
+                  </pic:nvPicPr>
+                  <pic:blipFill>
+                    <a:blip r:embed="rId8" cstate="print">
+                      <a:extLst>
+                        <a:ext uri="{28A0092B-C50C-407E-A947-70E740481C1C}">
+                          <a14:useLocalDpi xmlns:a14="http://schemas.microsoft.com/office/drawing/2010/main" val="0"/>
+                        </a:ext>
+                      </a:extLst>
+                    </a:blip>
+                    <a:stretch>
+                      <a:fillRect/>
+                    </a:stretch>
+                  </pic:blipFill>
+                  <pic:spPr>
+                    <a:xfrm>
+                      <a:off x="0" y="0"/>
+                      <a:ext cx="5943600" cy="3031474"/>
+                    </a:xfrm>
+                    <a:prstGeom prst="rect">
+                      <a:avLst/>
+                    </a:prstGeom>
+                  </pic:spPr>
+                </pic:pic>
+              </a:graphicData>
+            </a:graphic>
+          </wp:inline>
+        </w:drawing>
+      </w:r>
+    </w:p>
+    <w:tbl>
+      <w:tblPr>
+        <w:tblStyle w:val="TableGrid"/>
+        <w:tblW w:w="0" w:type="auto"/>
+        <w:tblLook w:val="04A0" w:firstRow="1" w:lastRow="0" w:firstColumn="1" w:lastColumn="0" w:noHBand="0" w:noVBand="1"/>
+      </w:tblPr>
+      <w:tblGrid>
+        <w:gridCol w:w="1435"/>
+        <w:gridCol w:w="2340"/>
+        <w:gridCol w:w="2520"/>
+      </w:tblGrid>
+      <w:tr>
+        <w:trPr>
+          <w:tblHeader/>
+        </w:trPr>
+        <w:tc>
+          <w:tcPr>
+            <w:tcW w:w="1435" w:type="dxa"/>
+            <w:shd w:val="clear" w:color="auto" w:fill="D9D9D9" w:themeFill="background1" w:themeFillShade="D9"/>
+          </w:tcPr>
+          <w:p>
+            <w:pPr>
+              <w:rPr>
+                <w:b/>
+                <w:bCs/>
+              </w:rPr>
+            </w:pPr>
+          </w:p>
+        </w:tc>
+        <w:tc>
+          <w:tcPr>
+            <w:tcW w:w="2340" w:type="dxa"/>
+            <w:shd w:val="clear" w:color="auto" w:fill="D9D9D9" w:themeFill="background1" w:themeFillShade="D9"/>
+          </w:tcPr>
+          <w:p>
+            <w:pPr>
+              <w:rPr>
+                <w:b/>
+                <w:bCs/>
+              </w:rPr>
+            </w:pPr>
+            <w:r>
+              <w:rPr>
+                <w:b/>
+                <w:bCs/>
+              </w:rPr>
+              <w:t>A11y</w:t>
+            </w:r>
+            <w:r>
+              <w:rPr>
+                <w:b/>
+                <w:bCs/>
+              </w:rPr>
+              <w:t xml:space="preserve"> automated checker</w:t>
+            </w:r>
+          </w:p>
+        </w:tc>
+        <w:tc>
+          <w:tcPr>
+            <w:tcW w:w="2520" w:type="dxa"/>
+            <w:shd w:val="clear" w:color="auto" w:fill="D9D9D9" w:themeFill="background1" w:themeFillShade="D9"/>
+          </w:tcPr>
+          <w:p>
+            <w:pPr>
+              <w:rPr>
+                <w:b/>
+                <w:bCs/>
+              </w:rPr>
+            </w:pPr>
+            <w:r>
+              <w:rPr>
+                <w:b/>
+                <w:bCs/>
+              </w:rPr>
+              <w:t xml:space="preserve">MS Accessibility </w:t>
+            </w:r>
+            <w:r>
+              <w:rPr>
+                <w:b/>
+                <w:bCs/>
+              </w:rPr>
+              <w:t>c</w:t>
+            </w:r>
+            <w:r>
+              <w:rPr>
+                <w:b/>
+                <w:bCs/>
+              </w:rPr>
+              <w:t>hecker</w:t>
+            </w:r>
+          </w:p>
+        </w:tc>
+      </w:tr>
+      <w:tr>
+        <w:tc>
+          <w:tcPr>
+            <w:tcW w:w="1435" w:type="dxa"/>
+          </w:tcPr>
+          <w:p>
+            <w:pPr>
+              <w:rPr>
+                <w:b/>
+                <w:bCs/>
+              </w:rPr>
+            </w:pPr>
+            <w:r>
+              <w:rPr>
+                <w:b/>
+                <w:bCs/>
+              </w:rPr>
+              <w:t>Result</w:t>
+            </w:r>
+          </w:p>
+        </w:tc>
+        <w:tc>
+          <w:tcPr>
+            <w:tcW w:w="2340" w:type="dxa"/>
+          </w:tcPr>
+          <w:p>
+            <w:r>
+              <w:t>No error to detect</w:t>
+            </w:r>
+          </w:p>
+        </w:tc>
+        <w:tc>
+          <w:tcPr>
+            <w:tcW w:w="2520" w:type="dxa"/>
+          </w:tcPr>
+          <w:p>
+            <w:r>
+              <w:t>No error to detect</w:t>
+            </w:r>
+          </w:p>
+        </w:tc>
+      </w:tr>
+    </w:tbl>
+    <w:p>
+      <w:pPr>
+        <w:rPr>
+          <w:rFonts w:asciiTheme="majorHAnsi" w:eastAsiaTheme="majorEastAsia" w:hAnsiTheme="majorHAnsi" w:cstheme="majorBidi"/>
+          <w:color w:val="0F4761" w:themeColor="accent1" w:themeShade="BF"/>
+          <w:sz w:val="32"/>
+          <w:szCs w:val="32"/>
+        </w:rPr>
+      </w:pPr>
+      <w:r>
+        <w:br w:type="page"/>
+      </w:r>
+    </w:p>
+    <w:p>
+      <w:pPr>
+        <w:pStyle w:val="Heading2"/>
+      </w:pPr>
+      <w:r>
+        <w:lastRenderedPageBreak/>
         <w:t xml:space="preserve">Poorly constructed text </w:t>
       </w:r>
       <w:r>
@@ -866,7 +1180,7 @@
                     <pic:cNvPicPr/>
                   </pic:nvPicPr>
                   <pic:blipFill>
-                    <a:blip r:embed="rId7" cstate="print">
+                    <a:blip r:embed="rId9" cstate="print">
                       <a:extLst>
                         <a:ext uri="{28A0092B-C50C-407E-A947-70E740481C1C}">
                           <a14:useLocalDpi xmlns:a14="http://schemas.microsoft.com/office/drawing/2010/main" val="0"/>
@@ -1013,7 +1327,7 @@
           </w:tcPr>
           <w:p>
             <w:r>
-              <w:t>Yes</w:t>
+              <w:t>Detected</w:t>
             </w:r>
           </w:p>
         </w:tc>
@@ -1023,7 +1337,7 @@
           </w:tcPr>
           <w:p>
             <w:r>
-              <w:t>Yes</w:t>
+              <w:t>Detected</w:t>
             </w:r>
           </w:p>
         </w:tc>
@@ -1051,15 +1365,7 @@
     </w:p>
     <w:p>
       <w:r>
-        <w:t>The text alternative here is just the file name “</w:t>
-      </w:r>
-      <w:proofErr w:type="spellStart"/>
-      <w:r>
-        <w:t>askdfjasldfkjasdf</w:t>
-      </w:r>
-      <w:proofErr w:type="spellEnd"/>
-      <w:r>
-        <w:t>.”</w:t>
+        <w:t>The text alternative here is just the file name “askdfjasldfkjasdf.”</w:t>
       </w:r>
     </w:p>
     <w:p>
@@ -1083,7 +1389,7 @@
                     <pic:cNvPicPr/>
                   </pic:nvPicPr>
                   <pic:blipFill>
-                    <a:blip r:embed="rId7" cstate="print">
+                    <a:blip r:embed="rId9" cstate="print">
                       <a:extLst>
                         <a:ext uri="{28A0092B-C50C-407E-A947-70E740481C1C}">
                           <a14:useLocalDpi xmlns:a14="http://schemas.microsoft.com/office/drawing/2010/main" val="0"/>
@@ -1230,7 +1536,10 @@
           </w:tcPr>
           <w:p>
             <w:r>
-              <w:t>No</w:t>
+              <w:t xml:space="preserve">Not </w:t>
+            </w:r>
+            <w:r>
+              <w:t>Detected</w:t>
             </w:r>
           </w:p>
         </w:tc>
@@ -1240,7 +1549,10 @@
           </w:tcPr>
           <w:p>
             <w:r>
-              <w:t>No</w:t>
+              <w:t xml:space="preserve">Not </w:t>
+            </w:r>
+            <w:r>
+              <w:t>Detected</w:t>
             </w:r>
           </w:p>
         </w:tc>
@@ -1252,28 +1564,18 @@
         <w:pStyle w:val="Heading2"/>
       </w:pPr>
       <w:r>
-        <w:lastRenderedPageBreak/>
         <w:t xml:space="preserve">Poorly constructed text </w:t>
       </w:r>
       <w:r>
         <w:t>alternative</w:t>
       </w:r>
       <w:r>
-        <w:t xml:space="preserve">: </w:t>
-      </w:r>
-      <w:r>
-        <w:t>placeholder</w:t>
+        <w:t>: placeholder</w:t>
       </w:r>
     </w:p>
     <w:p>
       <w:r>
-        <w:t>The text alternative here is just the file name “</w:t>
-      </w:r>
-      <w:r>
-        <w:t>image</w:t>
-      </w:r>
-      <w:r>
-        <w:t>.”</w:t>
+        <w:t>The text alternative here is just the file name “image.”</w:t>
       </w:r>
     </w:p>
     <w:p>
@@ -1297,7 +1599,7 @@
                     <pic:cNvPicPr/>
                   </pic:nvPicPr>
                   <pic:blipFill>
-                    <a:blip r:embed="rId7" cstate="print">
+                    <a:blip r:embed="rId9" cstate="print">
                       <a:extLst>
                         <a:ext uri="{28A0092B-C50C-407E-A947-70E740481C1C}">
                           <a14:useLocalDpi xmlns:a14="http://schemas.microsoft.com/office/drawing/2010/main" val="0"/>
@@ -1444,7 +1746,10 @@
           </w:tcPr>
           <w:p>
             <w:r>
-              <w:t>No</w:t>
+              <w:t xml:space="preserve">Not </w:t>
+            </w:r>
+            <w:r>
+              <w:t>Detected</w:t>
             </w:r>
           </w:p>
         </w:tc>
@@ -1454,12 +1759,16 @@
           </w:tcPr>
           <w:p>
             <w:r>
-              <w:t>No</w:t>
+              <w:t xml:space="preserve">Not </w:t>
+            </w:r>
+            <w:r>
+              <w:t>Detected</w:t>
             </w:r>
           </w:p>
         </w:tc>
       </w:tr>
     </w:tbl>
+    <w:p/>
     <w:p/>
     <w:sectPr>
       <w:pgSz w:w="12240" w:h="15840"/>
@@ -1901,11 +2210,11 @@
     <w:uiPriority w:val="9"/>
     <w:unhideWhenUsed/>
     <w:qFormat/>
-    <w:rsid w:val="009A770B"/>
+    <w:rsid w:val="001D04BA"/>
     <w:pPr>
       <w:keepNext/>
       <w:keepLines/>
-      <w:spacing w:before="160" w:after="80"/>
+      <w:spacing w:before="300" w:after="80"/>
       <w:outlineLvl w:val="1"/>
     </w:pPr>
     <w:rPr>
@@ -1921,7 +2230,6 @@
     <w:next w:val="Normal"/>
     <w:link w:val="Heading3Char"/>
     <w:uiPriority w:val="9"/>
-    <w:semiHidden/>
     <w:unhideWhenUsed/>
     <w:qFormat/>
     <w:rsid w:val="009A770B"/>
@@ -2115,7 +2423,7 @@
     <w:basedOn w:val="DefaultParagraphFont"/>
     <w:link w:val="Heading2"/>
     <w:uiPriority w:val="9"/>
-    <w:rsid w:val="009A770B"/>
+    <w:rsid w:val="001D04BA"/>
     <w:rPr>
       <w:rFonts w:asciiTheme="majorHAnsi" w:eastAsiaTheme="majorEastAsia" w:hAnsiTheme="majorHAnsi" w:cstheme="majorBidi"/>
       <w:color w:val="0F4761" w:themeColor="accent1" w:themeShade="BF"/>
@@ -2128,7 +2436,6 @@
     <w:basedOn w:val="DefaultParagraphFont"/>
     <w:link w:val="Heading3"/>
     <w:uiPriority w:val="9"/>
-    <w:semiHidden/>
     <w:rsid w:val="009A770B"/>
     <w:rPr>
       <w:rFonts w:eastAsiaTheme="majorEastAsia" w:cstheme="majorBidi"/>
@@ -2422,67 +2729,7 @@
     </mc:Fallback>
   </mc:AlternateContent>
   <c:chart>
-    <c:title>
-      <c:tx>
-        <c:rich>
-          <a:bodyPr rot="0" spcFirstLastPara="1" vertOverflow="ellipsis" vert="horz" wrap="square" anchor="ctr" anchorCtr="1"/>
-          <a:lstStyle/>
-          <a:p>
-            <a:pPr>
-              <a:defRPr sz="1400" b="0" i="0" u="none" strike="noStrike" kern="1200" spc="0" baseline="0">
-                <a:solidFill>
-                  <a:schemeClr val="tx1">
-                    <a:lumMod val="65000"/>
-                    <a:lumOff val="35000"/>
-                  </a:schemeClr>
-                </a:solidFill>
-                <a:latin typeface="+mn-lt"/>
-                <a:ea typeface="+mn-ea"/>
-                <a:cs typeface="+mn-cs"/>
-              </a:defRPr>
-            </a:pPr>
-            <a:r>
-              <a:rPr lang="en-US"/>
-              <a:t>Quiz</a:t>
-            </a:r>
-            <a:r>
-              <a:rPr lang="en-US" baseline="0"/>
-              <a:t> averages</a:t>
-            </a:r>
-            <a:endParaRPr lang="en-US"/>
-          </a:p>
-        </c:rich>
-      </c:tx>
-      <c:overlay val="0"/>
-      <c:spPr>
-        <a:noFill/>
-        <a:ln>
-          <a:noFill/>
-        </a:ln>
-        <a:effectLst/>
-      </c:spPr>
-      <c:txPr>
-        <a:bodyPr rot="0" spcFirstLastPara="1" vertOverflow="ellipsis" vert="horz" wrap="square" anchor="ctr" anchorCtr="1"/>
-        <a:lstStyle/>
-        <a:p>
-          <a:pPr>
-            <a:defRPr sz="1400" b="0" i="0" u="none" strike="noStrike" kern="1200" spc="0" baseline="0">
-              <a:solidFill>
-                <a:schemeClr val="tx1">
-                  <a:lumMod val="65000"/>
-                  <a:lumOff val="35000"/>
-                </a:schemeClr>
-              </a:solidFill>
-              <a:latin typeface="+mn-lt"/>
-              <a:ea typeface="+mn-ea"/>
-              <a:cs typeface="+mn-cs"/>
-            </a:defRPr>
-          </a:pPr>
-          <a:endParaRPr lang="en-US"/>
-        </a:p>
-      </c:txPr>
-    </c:title>
-    <c:autoTitleDeleted val="0"/>
+    <c:autoTitleDeleted val="1"/>
     <c:plotArea>
       <c:layout/>
       <c:barChart>
@@ -2498,7 +2745,7 @@
               <c:strCache>
                 <c:ptCount val="1"/>
                 <c:pt idx="0">
-                  <c:v>Quiz 1 Average</c:v>
+                  <c:v>Quiz 1 Avg</c:v>
                 </c:pt>
               </c:strCache>
             </c:strRef>
@@ -2513,11 +2760,70 @@
             <a:effectLst/>
           </c:spPr>
           <c:invertIfNegative val="0"/>
+          <c:dLbls>
+            <c:spPr>
+              <a:noFill/>
+              <a:ln>
+                <a:noFill/>
+              </a:ln>
+              <a:effectLst/>
+            </c:spPr>
+            <c:txPr>
+              <a:bodyPr rot="0" spcFirstLastPara="1" vertOverflow="ellipsis" vert="horz" wrap="square" lIns="38100" tIns="19050" rIns="38100" bIns="19050" anchor="ctr" anchorCtr="1">
+                <a:spAutoFit/>
+              </a:bodyPr>
+              <a:lstStyle/>
+              <a:p>
+                <a:pPr>
+                  <a:defRPr sz="900" b="0" i="0" u="none" strike="noStrike" kern="1200" baseline="0">
+                    <a:solidFill>
+                      <a:schemeClr val="tx1">
+                        <a:lumMod val="75000"/>
+                        <a:lumOff val="25000"/>
+                      </a:schemeClr>
+                    </a:solidFill>
+                    <a:latin typeface="+mn-lt"/>
+                    <a:ea typeface="+mn-ea"/>
+                    <a:cs typeface="+mn-cs"/>
+                  </a:defRPr>
+                </a:pPr>
+                <a:endParaRPr lang="en-US"/>
+              </a:p>
+            </c:txPr>
+            <c:showLegendKey val="0"/>
+            <c:showVal val="1"/>
+            <c:showCatName val="0"/>
+            <c:showSerName val="1"/>
+            <c:showPercent val="0"/>
+            <c:showBubbleSize val="0"/>
+            <c:separator>
+</c:separator>
+            <c:showLeaderLines val="0"/>
+            <c:extLst>
+              <c:ext xmlns:c15="http://schemas.microsoft.com/office/drawing/2012/chart" uri="{CE6537A1-D6FC-4f65-9D91-7224C49458BB}">
+                <c15:showLeaderLines val="1"/>
+                <c15:leaderLines>
+                  <c:spPr>
+                    <a:ln w="9525" cap="flat" cmpd="sng" algn="ctr">
+                      <a:solidFill>
+                        <a:schemeClr val="tx1">
+                          <a:lumMod val="35000"/>
+                          <a:lumOff val="65000"/>
+                        </a:schemeClr>
+                      </a:solidFill>
+                      <a:round/>
+                    </a:ln>
+                    <a:effectLst/>
+                  </c:spPr>
+                </c15:leaderLines>
+              </c:ext>
+            </c:extLst>
+          </c:dLbls>
           <c:cat>
             <c:strRef>
-              <c:f>Sheet1!$A$2:$A$5</c:f>
+              <c:f>Sheet1!$A$2:$A$4</c:f>
               <c:strCache>
-                <c:ptCount val="4"/>
+                <c:ptCount val="3"/>
                 <c:pt idx="0">
                   <c:v>Section 1</c:v>
                 </c:pt>
@@ -2527,18 +2833,15 @@
                 <c:pt idx="2">
                   <c:v>Section 3</c:v>
                 </c:pt>
-                <c:pt idx="3">
-                  <c:v>Section 4</c:v>
-                </c:pt>
               </c:strCache>
             </c:strRef>
           </c:cat>
           <c:val>
             <c:numRef>
-              <c:f>Sheet1!$B$2:$B$5</c:f>
+              <c:f>Sheet1!$B$2:$B$4</c:f>
               <c:numCache>
                 <c:formatCode>0%</c:formatCode>
-                <c:ptCount val="4"/>
+                <c:ptCount val="3"/>
                 <c:pt idx="0">
                   <c:v>0.85</c:v>
                 </c:pt>
@@ -2547,9 +2850,6 @@
                 </c:pt>
                 <c:pt idx="2">
                   <c:v>0.85</c:v>
-                </c:pt>
-                <c:pt idx="3">
-                  <c:v>0.87</c:v>
                 </c:pt>
               </c:numCache>
             </c:numRef>
@@ -2569,7 +2869,7 @@
               <c:strCache>
                 <c:ptCount val="1"/>
                 <c:pt idx="0">
-                  <c:v>Quiz 2 Average</c:v>
+                  <c:v>Quiz 2 Avg</c:v>
                 </c:pt>
               </c:strCache>
             </c:strRef>
@@ -2584,11 +2884,70 @@
             <a:effectLst/>
           </c:spPr>
           <c:invertIfNegative val="0"/>
+          <c:dLbls>
+            <c:spPr>
+              <a:noFill/>
+              <a:ln>
+                <a:noFill/>
+              </a:ln>
+              <a:effectLst/>
+            </c:spPr>
+            <c:txPr>
+              <a:bodyPr rot="0" spcFirstLastPara="1" vertOverflow="ellipsis" vert="horz" wrap="square" lIns="38100" tIns="19050" rIns="38100" bIns="19050" anchor="ctr" anchorCtr="1">
+                <a:spAutoFit/>
+              </a:bodyPr>
+              <a:lstStyle/>
+              <a:p>
+                <a:pPr>
+                  <a:defRPr sz="900" b="0" i="0" u="none" strike="noStrike" kern="1200" baseline="0">
+                    <a:solidFill>
+                      <a:schemeClr val="tx1">
+                        <a:lumMod val="75000"/>
+                        <a:lumOff val="25000"/>
+                      </a:schemeClr>
+                    </a:solidFill>
+                    <a:latin typeface="+mn-lt"/>
+                    <a:ea typeface="+mn-ea"/>
+                    <a:cs typeface="+mn-cs"/>
+                  </a:defRPr>
+                </a:pPr>
+                <a:endParaRPr lang="en-US"/>
+              </a:p>
+            </c:txPr>
+            <c:showLegendKey val="0"/>
+            <c:showVal val="1"/>
+            <c:showCatName val="0"/>
+            <c:showSerName val="1"/>
+            <c:showPercent val="0"/>
+            <c:showBubbleSize val="0"/>
+            <c:separator>
+</c:separator>
+            <c:showLeaderLines val="0"/>
+            <c:extLst>
+              <c:ext xmlns:c15="http://schemas.microsoft.com/office/drawing/2012/chart" uri="{CE6537A1-D6FC-4f65-9D91-7224C49458BB}">
+                <c15:showLeaderLines val="1"/>
+                <c15:leaderLines>
+                  <c:spPr>
+                    <a:ln w="9525" cap="flat" cmpd="sng" algn="ctr">
+                      <a:solidFill>
+                        <a:schemeClr val="tx1">
+                          <a:lumMod val="35000"/>
+                          <a:lumOff val="65000"/>
+                        </a:schemeClr>
+                      </a:solidFill>
+                      <a:round/>
+                    </a:ln>
+                    <a:effectLst/>
+                  </c:spPr>
+                </c15:leaderLines>
+              </c:ext>
+            </c:extLst>
+          </c:dLbls>
           <c:cat>
             <c:strRef>
-              <c:f>Sheet1!$A$2:$A$5</c:f>
+              <c:f>Sheet1!$A$2:$A$4</c:f>
               <c:strCache>
-                <c:ptCount val="4"/>
+                <c:ptCount val="3"/>
                 <c:pt idx="0">
                   <c:v>Section 1</c:v>
                 </c:pt>
@@ -2598,18 +2957,15 @@
                 <c:pt idx="2">
                   <c:v>Section 3</c:v>
                 </c:pt>
-                <c:pt idx="3">
-                  <c:v>Section 4</c:v>
-                </c:pt>
               </c:strCache>
             </c:strRef>
           </c:cat>
           <c:val>
             <c:numRef>
-              <c:f>Sheet1!$C$2:$C$5</c:f>
+              <c:f>Sheet1!$C$2:$C$4</c:f>
               <c:numCache>
                 <c:formatCode>0%</c:formatCode>
-                <c:ptCount val="4"/>
+                <c:ptCount val="3"/>
                 <c:pt idx="0">
                   <c:v>0.82</c:v>
                 </c:pt>
@@ -2618,9 +2974,6 @@
                 </c:pt>
                 <c:pt idx="2">
                   <c:v>0.82</c:v>
-                </c:pt>
-                <c:pt idx="3">
-                  <c:v>0.79</c:v>
                 </c:pt>
               </c:numCache>
             </c:numRef>
@@ -2631,87 +2984,15 @@
             </c:ext>
           </c:extLst>
         </c:ser>
-        <c:ser>
-          <c:idx val="2"/>
-          <c:order val="2"/>
-          <c:tx>
-            <c:strRef>
-              <c:f>Sheet1!$D$1</c:f>
-              <c:strCache>
-                <c:ptCount val="1"/>
-                <c:pt idx="0">
-                  <c:v>Quiz 3 Average</c:v>
-                </c:pt>
-              </c:strCache>
-            </c:strRef>
-          </c:tx>
-          <c:spPr>
-            <a:solidFill>
-              <a:schemeClr val="accent3"/>
-            </a:solidFill>
-            <a:ln>
-              <a:noFill/>
-            </a:ln>
-            <a:effectLst/>
-          </c:spPr>
-          <c:invertIfNegative val="0"/>
-          <c:cat>
-            <c:strRef>
-              <c:f>Sheet1!$A$2:$A$5</c:f>
-              <c:strCache>
-                <c:ptCount val="4"/>
-                <c:pt idx="0">
-                  <c:v>Section 1</c:v>
-                </c:pt>
-                <c:pt idx="1">
-                  <c:v>Section 2</c:v>
-                </c:pt>
-                <c:pt idx="2">
-                  <c:v>Section 3</c:v>
-                </c:pt>
-                <c:pt idx="3">
-                  <c:v>Section 4</c:v>
-                </c:pt>
-              </c:strCache>
-            </c:strRef>
-          </c:cat>
-          <c:val>
-            <c:numRef>
-              <c:f>Sheet1!$D$2:$D$5</c:f>
-              <c:numCache>
-                <c:formatCode>0%</c:formatCode>
-                <c:ptCount val="4"/>
-                <c:pt idx="0">
-                  <c:v>0.91</c:v>
-                </c:pt>
-                <c:pt idx="1">
-                  <c:v>0.9</c:v>
-                </c:pt>
-                <c:pt idx="2">
-                  <c:v>0.9</c:v>
-                </c:pt>
-                <c:pt idx="3">
-                  <c:v>0.93</c:v>
-                </c:pt>
-              </c:numCache>
-            </c:numRef>
-          </c:val>
-          <c:extLst>
-            <c:ext xmlns:c16="http://schemas.microsoft.com/office/drawing/2014/chart" uri="{C3380CC4-5D6E-409C-BE32-E72D297353CC}">
-              <c16:uniqueId val="{00000002-EAA9-E84C-BE27-3B59EDB1FC9C}"/>
-            </c:ext>
-          </c:extLst>
-        </c:ser>
         <c:dLbls>
           <c:showLegendKey val="0"/>
-          <c:showVal val="0"/>
+          <c:showVal val="1"/>
           <c:showCatName val="0"/>
           <c:showSerName val="0"/>
           <c:showPercent val="0"/>
           <c:showBubbleSize val="0"/>
         </c:dLbls>
-        <c:gapWidth val="219"/>
-        <c:overlap val="-27"/>
+        <c:gapWidth val="75"/>
         <c:axId val="1408948224"/>
         <c:axId val="1409147776"/>
       </c:barChart>
@@ -2773,20 +3054,6 @@
         </c:scaling>
         <c:delete val="0"/>
         <c:axPos val="l"/>
-        <c:majorGridlines>
-          <c:spPr>
-            <a:ln w="9525" cap="flat" cmpd="sng" algn="ctr">
-              <a:solidFill>
-                <a:schemeClr val="tx1">
-                  <a:lumMod val="15000"/>
-                  <a:lumOff val="85000"/>
-                </a:schemeClr>
-              </a:solidFill>
-              <a:round/>
-            </a:ln>
-            <a:effectLst/>
-          </c:spPr>
-        </c:majorGridlines>
         <c:numFmt formatCode="0%" sourceLinked="1"/>
         <c:majorTickMark val="none"/>
         <c:minorTickMark val="none"/>
@@ -3739,4 +4006,16 @@
     </a:ext>
   </a:extLst>
 </a:theme>
+</file>
+
+<file path=customXml/item1.xml><?xml version="1.0" encoding="utf-8"?>
+<b:Sources xmlns:b="http://schemas.openxmlformats.org/officeDocument/2006/bibliography" xmlns="http://schemas.openxmlformats.org/officeDocument/2006/bibliography" SelectedStyle="/APASixthEditionOfficeOnline.xsl" StyleName="APA" Version="6"/>
+</file>
+
+<file path=customXml/itemProps1.xml><?xml version="1.0" encoding="utf-8"?>
+<ds:datastoreItem xmlns:ds="http://schemas.openxmlformats.org/officeDocument/2006/customXml" ds:itemID="{C94D25D7-358C-DC4A-B9F4-5E9D8F8A84A3}">
+  <ds:schemaRefs>
+    <ds:schemaRef ds:uri="http://schemas.openxmlformats.org/officeDocument/2006/bibliography"/>
+  </ds:schemaRefs>
+</ds:datastoreItem>
 </file>
</xml_diff>